<commit_message>
just finished task 1 had to refactor a lot of stuff from previous lab to make it procedural
</commit_message>
<xml_diff>
--- a/VulkanLab2/Vulkan(1_3)_Lab_02/Vulkan-Lab2.docx
+++ b/VulkanLab2/Vulkan(1_3)_Lab_02/Vulkan-Lab2.docx
@@ -120,7 +120,7 @@
           </mc:Choice>
           <mc:Fallback>
             <w:pict>
-              <v:shape w14:anchorId="2E185586" id="Graphic 4" o:spid="_x0000_s1026" style="position:absolute;margin-left:43pt;margin-top:4.5pt;width:510pt;height:.75pt;z-index:-251666432;visibility:visible;mso-wrap-style:square;mso-wrap-distance-left:0;mso-wrap-distance-top:0;mso-wrap-distance-right:0;mso-wrap-distance-bottom:0;mso-position-horizontal:absolute;mso-position-horizontal-relative:page;mso-position-vertical:absolute;mso-position-vertical-relative:text;v-text-anchor:top" coordsize="6477000,9525" o:gfxdata="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" path="m6476999,9524l,9524,,,6476999,r,9524xe" fillcolor="black" stroked="f">
+              <v:shape w14:anchorId="7D465545" id="Graphic 4" o:spid="_x0000_s1026" style="position:absolute;margin-left:43pt;margin-top:4.5pt;width:510pt;height:.75pt;z-index:-251666432;visibility:visible;mso-wrap-style:square;mso-wrap-distance-left:0;mso-wrap-distance-top:0;mso-wrap-distance-right:0;mso-wrap-distance-bottom:0;mso-position-horizontal:absolute;mso-position-horizontal-relative:page;mso-position-vertical:absolute;mso-position-vertical-relative:text;v-text-anchor:top" coordsize="6477000,9525" o:gfxdata="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" path="m6476999,9524l,9524,,,6476999,r,9524xe" fillcolor="black" stroked="f">
                 <v:path arrowok="t"/>
                 <w10:wrap type="topAndBottom" anchorx="page"/>
               </v:shape>
@@ -475,6 +475,109 @@
       <w:pPr>
         <w:pStyle w:val="Heading2"/>
       </w:pPr>
+      <w:r>
+        <w:drawing>
+          <wp:inline distT="0" distB="0" distL="0" distR="0" wp14:anchorId="035E6BB8" wp14:editId="58571C7A">
+            <wp:extent cx="5105662" cy="4102311"/>
+            <wp:effectExtent l="0" t="0" r="0" b="0"/>
+            <wp:docPr id="1802564745" name="Picture 1"/>
+            <wp:cNvGraphicFramePr>
+              <a:graphicFrameLocks xmlns:a="http://schemas.openxmlformats.org/drawingml/2006/main" noChangeAspect="1"/>
+            </wp:cNvGraphicFramePr>
+            <a:graphic xmlns:a="http://schemas.openxmlformats.org/drawingml/2006/main">
+              <a:graphicData uri="http://schemas.openxmlformats.org/drawingml/2006/picture">
+                <pic:pic xmlns:pic="http://schemas.openxmlformats.org/drawingml/2006/picture">
+                  <pic:nvPicPr>
+                    <pic:cNvPr id="1802564745" name=""/>
+                    <pic:cNvPicPr/>
+                  </pic:nvPicPr>
+                  <pic:blipFill>
+                    <a:blip r:embed="rId8"/>
+                    <a:stretch>
+                      <a:fillRect/>
+                    </a:stretch>
+                  </pic:blipFill>
+                  <pic:spPr>
+                    <a:xfrm>
+                      <a:off x="0" y="0"/>
+                      <a:ext cx="5105662" cy="4102311"/>
+                    </a:xfrm>
+                    <a:prstGeom prst="rect">
+                      <a:avLst/>
+                    </a:prstGeom>
+                  </pic:spPr>
+                </pic:pic>
+              </a:graphicData>
+            </a:graphic>
+          </wp:inline>
+        </w:drawing>
+      </w:r>
+    </w:p>
+    <w:p>
+      <w:pPr>
+        <w:pStyle w:val="Heading2"/>
+      </w:pPr>
+    </w:p>
+    <w:p>
+      <w:pPr>
+        <w:pStyle w:val="Heading2"/>
+      </w:pPr>
+      <w:r>
+        <w:lastRenderedPageBreak/>
+        <w:t>Correct camera coords</w:t>
+      </w:r>
+    </w:p>
+    <w:p>
+      <w:pPr>
+        <w:pStyle w:val="Heading2"/>
+      </w:pPr>
+    </w:p>
+    <w:p>
+      <w:pPr>
+        <w:pStyle w:val="Heading2"/>
+      </w:pPr>
+      <w:r>
+        <w:drawing>
+          <wp:inline distT="0" distB="0" distL="0" distR="0" wp14:anchorId="14B2DADB" wp14:editId="6D27BA82">
+            <wp:extent cx="6567170" cy="2311400"/>
+            <wp:effectExtent l="0" t="0" r="5080" b="0"/>
+            <wp:docPr id="1474587601" name="Picture 1"/>
+            <wp:cNvGraphicFramePr>
+              <a:graphicFrameLocks xmlns:a="http://schemas.openxmlformats.org/drawingml/2006/main" noChangeAspect="1"/>
+            </wp:cNvGraphicFramePr>
+            <a:graphic xmlns:a="http://schemas.openxmlformats.org/drawingml/2006/main">
+              <a:graphicData uri="http://schemas.openxmlformats.org/drawingml/2006/picture">
+                <pic:pic xmlns:pic="http://schemas.openxmlformats.org/drawingml/2006/picture">
+                  <pic:nvPicPr>
+                    <pic:cNvPr id="1474587601" name=""/>
+                    <pic:cNvPicPr/>
+                  </pic:nvPicPr>
+                  <pic:blipFill>
+                    <a:blip r:embed="rId9"/>
+                    <a:stretch>
+                      <a:fillRect/>
+                    </a:stretch>
+                  </pic:blipFill>
+                  <pic:spPr>
+                    <a:xfrm>
+                      <a:off x="0" y="0"/>
+                      <a:ext cx="6567170" cy="2311400"/>
+                    </a:xfrm>
+                    <a:prstGeom prst="rect">
+                      <a:avLst/>
+                    </a:prstGeom>
+                  </pic:spPr>
+                </pic:pic>
+              </a:graphicData>
+            </a:graphic>
+          </wp:inline>
+        </w:drawing>
+      </w:r>
+    </w:p>
+    <w:p>
+      <w:pPr>
+        <w:pStyle w:val="Heading2"/>
+      </w:pPr>
     </w:p>
     <w:p>
       <w:pPr>
@@ -514,8 +617,8 @@
           <w:sz w:val="16"/>
         </w:rPr>
         <w:sectPr>
-          <w:headerReference w:type="default" r:id="rId8"/>
-          <w:footerReference w:type="default" r:id="rId9"/>
+          <w:headerReference w:type="default" r:id="rId10"/>
+          <w:footerReference w:type="default" r:id="rId11"/>
           <w:type w:val="continuous"/>
           <w:pgSz w:w="11900" w:h="16840"/>
           <w:pgMar w:top="760" w:right="708" w:bottom="500" w:left="850" w:header="57" w:footer="261" w:gutter="0"/>
@@ -903,7 +1006,7 @@
           <w:sz w:val="21"/>
         </w:rPr>
       </w:pPr>
-      <w:hyperlink r:id="rId10">
+      <w:hyperlink r:id="rId12">
         <w:r>
           <w:rPr>
             <w:rFonts w:ascii="Segoe UI" w:hAnsi="Segoe UI"/>

</xml_diff>